<commit_message>
Improve real BERT demo workflow
</commit_message>
<xml_diff>
--- a/outputs/bert_thuyet_trinh.docx
+++ b/outputs/bert_thuyet_trinh.docx
@@ -227,10 +227,7 @@
     </w:p>
     <w:p>
       <w:r>
-        <w:rPr>
-          <w:rFonts w:ascii="Calibri" w:hAnsi="Calibri" w:cs="Calibri"/>
-        </w:rPr>
-        <w:t>Khi đưa một câu vào BERT, câu đó sẽ được tách thành các token. Token có thể là một từ hoặc một phần nhỏ của từ. Sau đó, các token được chuyển thành vector số để máy tính có thể xử lý.</w:t>
+        <w:t>Khi đưa một câu vào BERT, câu đó sẽ được tách thành các token. Trong bản demo, tokenizer WordPiece có thể tách một từ thành nhiều mảnh nhỏ, thêm [CLS] ở đầu câu và [SEP] ở cuối câu trước khi đưa vào model.</w:t>
       </w:r>
     </w:p>
     <w:p>
@@ -553,15 +550,12 @@
         <w:keepNext/>
       </w:pPr>
       <w:r>
-        <w:t>Ví dụ 1: Dự đoán từ bị che</w:t>
+        <w:t>Ví dụ 1: Dự đoán từ bị che bằng BERT Small</w:t>
       </w:r>
     </w:p>
     <w:p>
       <w:r>
-        <w:rPr>
-          <w:rFonts w:ascii="Calibri" w:hAnsi="Calibri" w:cs="Calibri"/>
-        </w:rPr>
-        <w:t>Đầu vào:</w:t>
+        <w:t>Đầu vào trong demo:</w:t>
       </w:r>
     </w:p>
     <w:p>
@@ -571,20 +565,12 @@
         <w:shd w:fill="F4F6F9"/>
       </w:pPr>
       <w:r>
-        <w:rPr>
-          <w:rFonts w:ascii="Consolas" w:hAnsi="Consolas" w:cs="Consolas"/>
-          <w:color w:val="222222"/>
-          <w:sz w:val="20"/>
-        </w:rPr>
-        <w:t>Hôm nay trời rất [MASK], tôi muốn đi chơi.</w:t>
+        <w:t>Python is a programming [MASK].</w:t>
       </w:r>
     </w:p>
     <w:p>
       <w:r>
-        <w:rPr>
-          <w:rFonts w:ascii="Calibri" w:hAnsi="Calibri" w:cs="Calibri"/>
-        </w:rPr>
-        <w:t>BERT có thể dự đoán từ phù hợp là:</w:t>
+        <w:t>BERT thật có thể dự đoán từ phù hợp là:</w:t>
       </w:r>
     </w:p>
     <w:p>
@@ -594,20 +580,12 @@
         <w:shd w:fill="F4F6F9"/>
       </w:pPr>
       <w:r>
-        <w:rPr>
-          <w:rFonts w:ascii="Consolas" w:hAnsi="Consolas" w:cs="Consolas"/>
-          <w:color w:val="222222"/>
-          <w:sz w:val="20"/>
-        </w:rPr>
-        <w:t>Hôm nay trời rất đẹp, tôi muốn đi chơi.</w:t>
+        <w:t>Python is a programming language.</w:t>
       </w:r>
     </w:p>
     <w:p>
       <w:r>
-        <w:rPr>
-          <w:rFonts w:ascii="Calibri" w:hAnsi="Calibri" w:cs="Calibri"/>
-        </w:rPr>
-        <w:t>Ở ví dụ này, BERT dựa vào các từ xung quanh như “trời rất” và “tôi muốn đi chơi” để đoán rằng từ còn thiếu có thể là “đẹp”.</w:t>
+        <w:t>Ở ví dụ này, BERT dựa vào các từ xung quanh như Python, programming và vị trí [MASK] để đoán token phù hợp nhất là language.</w:t>
       </w:r>
     </w:p>
     <w:p>
@@ -765,15 +743,12 @@
         <w:keepNext/>
       </w:pPr>
       <w:r>
-        <w:t>6. Demo đơn giản có thể trình bày</w:t>
+        <w:t>6. Demo giao diện có thể trình bày</w:t>
       </w:r>
     </w:p>
     <w:p>
       <w:r>
-        <w:rPr>
-          <w:rFonts w:ascii="Calibri" w:hAnsi="Calibri" w:cs="Calibri"/>
-        </w:rPr>
-        <w:t>Nếu cần demo ngắn, có thể dùng chức năng dự đoán từ bị che. Ý tưởng là nhập một câu có [MASK], sau đó để BERT gợi ý từ phù hợp.</w:t>
+        <w:t>Trong bản demo hiện tại, tác vụ dự đoán [MASK] chạy BERT thật bằng Python, thư viện transformers và model BERT Small - google/bert_uncased_L-4_H-256_A-4 đã tải trong thư mục models/bert-small-en.</w:t>
       </w:r>
     </w:p>
     <w:p>
@@ -783,12 +758,7 @@
         <w:shd w:fill="F4F6F9"/>
       </w:pPr>
       <w:r>
-        <w:rPr>
-          <w:rFonts w:ascii="Consolas" w:hAnsi="Consolas" w:cs="Consolas"/>
-          <w:color w:val="222222"/>
-          <w:sz w:val="20"/>
-        </w:rPr>
-        <w:t>from transformers import pipeline</w:t>
+        <w:t>Câu mẫu nên dùng khi trình bày:</w:t>
       </w:r>
     </w:p>
     <w:p>
@@ -798,11 +768,7 @@
         <w:shd w:fill="F4F6F9"/>
       </w:pPr>
       <w:r>
-        <w:rPr>
-          <w:rFonts w:ascii="Consolas" w:hAnsi="Consolas" w:cs="Consolas"/>
-          <w:color w:val="222222"/>
-          <w:sz w:val="20"/>
-        </w:rPr>
+        <w:t>Python is a programming [MASK].</w:t>
       </w:r>
     </w:p>
     <w:p>
@@ -812,12 +778,7 @@
         <w:shd w:fill="F4F6F9"/>
       </w:pPr>
       <w:r>
-        <w:rPr>
-          <w:rFonts w:ascii="Consolas" w:hAnsi="Consolas" w:cs="Consolas"/>
-          <w:color w:val="222222"/>
-          <w:sz w:val="20"/>
-        </w:rPr>
-        <w:t>fill_mask = pipeline('fill-mask', model='bert-base-multilingual-cased')</w:t>
+        <w:t>Kết quả thường thấy: BERT dự đoán language với xác suất cao nhất, vì cụm programming language rất phù hợp với ngữ cảnh.</w:t>
       </w:r>
     </w:p>
     <w:p>
@@ -827,12 +788,7 @@
         <w:shd w:fill="F4F6F9"/>
       </w:pPr>
       <w:r>
-        <w:rPr>
-          <w:rFonts w:ascii="Consolas" w:hAnsi="Consolas" w:cs="Consolas"/>
-          <w:color w:val="222222"/>
-          <w:sz w:val="20"/>
-        </w:rPr>
-        <w:t>result = fill_mask('Hôm nay trời rất [MASK].')</w:t>
+        <w:t>Giao diện hiển thị top-k dự đoán, câu đã được điền, token WordPiece thật và thông tin kiến trúc nhỏ của model như số layer, hidden size và số attention head.</w:t>
       </w:r>
     </w:p>
     <w:p>
@@ -842,11 +798,7 @@
         <w:shd w:fill="F4F6F9"/>
       </w:pPr>
       <w:r>
-        <w:rPr>
-          <w:rFonts w:ascii="Consolas" w:hAnsi="Consolas" w:cs="Consolas"/>
-          <w:color w:val="222222"/>
-          <w:sz w:val="20"/>
-        </w:rPr>
+        <w:t>Khi nói phần demo, có thể giải thích rằng [MASK] là vị trí bị che; BERT dùng cả bên trái và bên phải của vị trí đó để chọn token hợp lý nhất.</w:t>
       </w:r>
     </w:p>
     <w:p>
@@ -856,12 +808,7 @@
         <w:shd w:fill="F4F6F9"/>
       </w:pPr>
       <w:r>
-        <w:rPr>
-          <w:rFonts w:ascii="Consolas" w:hAnsi="Consolas" w:cs="Consolas"/>
-          <w:color w:val="222222"/>
-          <w:sz w:val="20"/>
-        </w:rPr>
-        <w:t>for item in result:</w:t>
+        <w:t>Lưu ý: phần phân loại cảm xúc và hỏi đáp trong giao diện hiện là mô phỏng quy trình. Muốn chạy thật hai tác vụ này cần thêm model BERT đã fine-tune riêng cho từng nhiệm vụ.</w:t>
       </w:r>
     </w:p>
     <w:p>
@@ -871,20 +818,12 @@
         <w:shd w:fill="F4F6F9"/>
       </w:pPr>
       <w:r>
-        <w:rPr>
-          <w:rFonts w:ascii="Consolas" w:hAnsi="Consolas" w:cs="Consolas"/>
-          <w:color w:val="222222"/>
-          <w:sz w:val="20"/>
-        </w:rPr>
-        <w:t xml:space="preserve">    print(item['sequence'], item['score'])</w:t>
+        <w:t>Lệnh chạy nhanh sau khi đã setup:</w:t>
       </w:r>
     </w:p>
     <w:p>
       <w:r>
-        <w:rPr>
-          <w:rFonts w:ascii="Calibri" w:hAnsi="Calibri" w:cs="Calibri"/>
-        </w:rPr>
-        <w:t>Khi trình bày demo, chỉ cần giải thích rằng [MASK] là vị trí bị che. BERT sẽ nhìn toàn bộ câu và dự đoán những từ có khả năng phù hợp nhất.</w:t>
+        <w:t>python server.py --model models/bert-small-en</w:t>
       </w:r>
     </w:p>
     <w:p>

</xml_diff>